<commit_message>
Update statistical data for elderly health analysis across regions and states
- Revised statistics for "2_Idosos_Saudaveis" with updated counts in documents, PDFs, and text files.
- Updated graphical representations for regions and states in PNG format.
- Adjusted statistics for "3_Idosos_com_Artrite" with new data reflecting changes in regional and state counts.
- Modified graphical outputs for "3_Idosos_com_Artrite" to align with updated statistics.
- Updated statistics for "4_Idosos_APENAS_Artrite" with revised counts in documents, PDFs, and text files.
- Changed graphical representations for "4_Idosos_APENAS_Artrite" to reflect new data.
- Added a new zip file containing exploratory analysis data.
</commit_message>
<xml_diff>
--- a/resultados_analise/2_Idosos_Saudaveis/estatisticas.docx
+++ b/resultados_analise/2_Idosos_Saudaveis/estatisticas.docx
@@ -66,7 +66,7 @@
           </w:tcPr>
           <w:p>
             <w:r>
-              <w:t>476</w:t>
+              <w:t>1098</w:t>
             </w:r>
           </w:p>
         </w:tc>
@@ -88,7 +88,7 @@
           </w:tcPr>
           <w:p>
             <w:r>
-              <w:t>1185</w:t>
+              <w:t>2583</w:t>
             </w:r>
           </w:p>
         </w:tc>
@@ -110,7 +110,7 @@
           </w:tcPr>
           <w:p>
             <w:r>
-              <w:t>825</w:t>
+              <w:t>2139</w:t>
             </w:r>
           </w:p>
         </w:tc>
@@ -132,7 +132,7 @@
           </w:tcPr>
           <w:p>
             <w:r>
-              <w:t>837</w:t>
+              <w:t>1302</w:t>
             </w:r>
           </w:p>
         </w:tc>
@@ -154,7 +154,7 @@
           </w:tcPr>
           <w:p>
             <w:r>
-              <w:t>550</w:t>
+              <w:t>865</w:t>
             </w:r>
           </w:p>
         </w:tc>
@@ -216,7 +216,7 @@
           </w:tcPr>
           <w:p>
             <w:r>
-              <w:t>103</w:t>
+              <w:t>271</w:t>
             </w:r>
           </w:p>
         </w:tc>
@@ -238,7 +238,7 @@
           </w:tcPr>
           <w:p>
             <w:r>
-              <w:t>140</w:t>
+              <w:t>328</w:t>
             </w:r>
           </w:p>
         </w:tc>
@@ -260,7 +260,7 @@
           </w:tcPr>
           <w:p>
             <w:r>
-              <w:t>66</w:t>
+              <w:t>228</w:t>
             </w:r>
           </w:p>
         </w:tc>
@@ -282,7 +282,7 @@
           </w:tcPr>
           <w:p>
             <w:r>
-              <w:t>170</w:t>
+              <w:t>410</w:t>
             </w:r>
           </w:p>
         </w:tc>
@@ -304,7 +304,7 @@
           </w:tcPr>
           <w:p>
             <w:r>
-              <w:t>173</w:t>
+              <w:t>312</w:t>
             </w:r>
           </w:p>
         </w:tc>
@@ -326,7 +326,7 @@
           </w:tcPr>
           <w:p>
             <w:r>
-              <w:t>203</w:t>
+              <w:t>376</w:t>
             </w:r>
           </w:p>
         </w:tc>
@@ -348,7 +348,7 @@
           </w:tcPr>
           <w:p>
             <w:r>
-              <w:t>96</w:t>
+              <w:t>277</w:t>
             </w:r>
           </w:p>
         </w:tc>
@@ -370,7 +370,7 @@
           </w:tcPr>
           <w:p>
             <w:r>
-              <w:t>166</w:t>
+              <w:t>324</w:t>
             </w:r>
           </w:p>
         </w:tc>
@@ -392,7 +392,7 @@
           </w:tcPr>
           <w:p>
             <w:r>
-              <w:t>115</w:t>
+              <w:t>254</w:t>
             </w:r>
           </w:p>
         </w:tc>
@@ -414,7 +414,7 @@
           </w:tcPr>
           <w:p>
             <w:r>
-              <w:t>239</w:t>
+              <w:t>561</w:t>
             </w:r>
           </w:p>
         </w:tc>
@@ -436,7 +436,7 @@
           </w:tcPr>
           <w:p>
             <w:r>
-              <w:t>121</w:t>
+              <w:t>292</w:t>
             </w:r>
           </w:p>
         </w:tc>
@@ -458,7 +458,7 @@
           </w:tcPr>
           <w:p>
             <w:r>
-              <w:t>144</w:t>
+              <w:t>275</w:t>
             </w:r>
           </w:p>
         </w:tc>
@@ -480,7 +480,7 @@
           </w:tcPr>
           <w:p>
             <w:r>
-              <w:t>240</w:t>
+              <w:t>423</w:t>
             </w:r>
           </w:p>
         </w:tc>
@@ -502,7 +502,7 @@
           </w:tcPr>
           <w:p>
             <w:r>
-              <w:t>204</w:t>
+              <w:t>334</w:t>
             </w:r>
           </w:p>
         </w:tc>
@@ -524,7 +524,7 @@
           </w:tcPr>
           <w:p>
             <w:r>
-              <w:t>139</w:t>
+              <w:t>331</w:t>
             </w:r>
           </w:p>
         </w:tc>
@@ -546,7 +546,7 @@
           </w:tcPr>
           <w:p>
             <w:r>
-              <w:t>198</w:t>
+              <w:t>481</w:t>
             </w:r>
           </w:p>
         </w:tc>
@@ -568,7 +568,7 @@
           </w:tcPr>
           <w:p>
             <w:r>
-              <w:t>200</w:t>
+              <w:t>425</w:t>
             </w:r>
           </w:p>
         </w:tc>
@@ -590,7 +590,7 @@
           </w:tcPr>
           <w:p>
             <w:r>
-              <w:t>154</w:t>
+              <w:t>262</w:t>
             </w:r>
           </w:p>
         </w:tc>
@@ -612,7 +612,7 @@
           </w:tcPr>
           <w:p>
             <w:r>
-              <w:t>134</w:t>
+              <w:t>336</w:t>
             </w:r>
           </w:p>
         </w:tc>
@@ -634,7 +634,7 @@
           </w:tcPr>
           <w:p>
             <w:r>
-              <w:t>171</w:t>
+              <w:t>247</w:t>
             </w:r>
           </w:p>
         </w:tc>
@@ -656,7 +656,7 @@
           </w:tcPr>
           <w:p>
             <w:r>
-              <w:t>322</w:t>
+              <w:t>412</w:t>
             </w:r>
           </w:p>
         </w:tc>
@@ -678,7 +678,7 @@
           </w:tcPr>
           <w:p>
             <w:r>
-              <w:t>94</w:t>
+              <w:t>226</w:t>
             </w:r>
           </w:p>
         </w:tc>
@@ -700,7 +700,7 @@
           </w:tcPr>
           <w:p>
             <w:r>
-              <w:t>89</w:t>
+              <w:t>312</w:t>
             </w:r>
           </w:p>
         </w:tc>
@@ -722,7 +722,7 @@
           </w:tcPr>
           <w:p>
             <w:r>
-              <w:t>175</w:t>
+              <w:t>284</w:t>
             </w:r>
           </w:p>
         </w:tc>
@@ -744,7 +744,7 @@
           </w:tcPr>
           <w:p>
             <w:r>
-              <w:t>96</w:t>
+              <w:t>245</w:t>
             </w:r>
           </w:p>
         </w:tc>
@@ -766,7 +766,7 @@
           </w:tcPr>
           <w:p>
             <w:r>
-              <w:t>275</w:t>
+              <w:t>467</w:t>
             </w:r>
           </w:p>
         </w:tc>
@@ -788,7 +788,7 @@
           </w:tcPr>
           <w:p>
             <w:r>
-              <w:t>105</w:t>
+              <w:t>211</w:t>
             </w:r>
           </w:p>
         </w:tc>

</xml_diff>

<commit_message>
Update statistical data for elderly health analysis
- Revised statistics for "Idosos Saudaveis" including updated counts for regions and states in .docx, .pdf, and .txt formats.
- Updated graphical representations for regions and states in "Idosos Saudaveis".
- Revised statistics for "Idosos com Artrite" with new counts for regions and states in .docx, .pdf, and .txt formats.
- Updated graphical representations for regions and states in "Idosos com Artrite".
- Revised statistics for "Idosos APENAS Artrite" with new counts for regions and states in .docx, .pdf, and .txt formats.
- Updated graphical representations for regions and states in "Idosos APENAS Artrite".
</commit_message>
<xml_diff>
--- a/resultados_analise/2_Idosos_Saudaveis/estatisticas.docx
+++ b/resultados_analise/2_Idosos_Saudaveis/estatisticas.docx
@@ -66,7 +66,7 @@
           </w:tcPr>
           <w:p>
             <w:r>
-              <w:t>1098</w:t>
+              <w:t>476</w:t>
             </w:r>
           </w:p>
         </w:tc>
@@ -88,7 +88,7 @@
           </w:tcPr>
           <w:p>
             <w:r>
-              <w:t>2583</w:t>
+              <w:t>1185</w:t>
             </w:r>
           </w:p>
         </w:tc>
@@ -110,7 +110,7 @@
           </w:tcPr>
           <w:p>
             <w:r>
-              <w:t>2139</w:t>
+              <w:t>825</w:t>
             </w:r>
           </w:p>
         </w:tc>
@@ -132,7 +132,7 @@
           </w:tcPr>
           <w:p>
             <w:r>
-              <w:t>1302</w:t>
+              <w:t>837</w:t>
             </w:r>
           </w:p>
         </w:tc>
@@ -154,7 +154,7 @@
           </w:tcPr>
           <w:p>
             <w:r>
-              <w:t>865</w:t>
+              <w:t>550</w:t>
             </w:r>
           </w:p>
         </w:tc>
@@ -216,7 +216,7 @@
           </w:tcPr>
           <w:p>
             <w:r>
-              <w:t>271</w:t>
+              <w:t>103</w:t>
             </w:r>
           </w:p>
         </w:tc>
@@ -238,7 +238,7 @@
           </w:tcPr>
           <w:p>
             <w:r>
-              <w:t>328</w:t>
+              <w:t>140</w:t>
             </w:r>
           </w:p>
         </w:tc>
@@ -260,7 +260,7 @@
           </w:tcPr>
           <w:p>
             <w:r>
-              <w:t>228</w:t>
+              <w:t>66</w:t>
             </w:r>
           </w:p>
         </w:tc>
@@ -282,7 +282,7 @@
           </w:tcPr>
           <w:p>
             <w:r>
-              <w:t>410</w:t>
+              <w:t>170</w:t>
             </w:r>
           </w:p>
         </w:tc>
@@ -304,7 +304,7 @@
           </w:tcPr>
           <w:p>
             <w:r>
-              <w:t>312</w:t>
+              <w:t>173</w:t>
             </w:r>
           </w:p>
         </w:tc>
@@ -326,7 +326,7 @@
           </w:tcPr>
           <w:p>
             <w:r>
-              <w:t>376</w:t>
+              <w:t>203</w:t>
             </w:r>
           </w:p>
         </w:tc>
@@ -348,7 +348,7 @@
           </w:tcPr>
           <w:p>
             <w:r>
-              <w:t>277</w:t>
+              <w:t>96</w:t>
             </w:r>
           </w:p>
         </w:tc>
@@ -370,7 +370,7 @@
           </w:tcPr>
           <w:p>
             <w:r>
-              <w:t>324</w:t>
+              <w:t>166</w:t>
             </w:r>
           </w:p>
         </w:tc>
@@ -392,7 +392,7 @@
           </w:tcPr>
           <w:p>
             <w:r>
-              <w:t>254</w:t>
+              <w:t>115</w:t>
             </w:r>
           </w:p>
         </w:tc>
@@ -414,7 +414,7 @@
           </w:tcPr>
           <w:p>
             <w:r>
-              <w:t>561</w:t>
+              <w:t>239</w:t>
             </w:r>
           </w:p>
         </w:tc>
@@ -436,7 +436,7 @@
           </w:tcPr>
           <w:p>
             <w:r>
-              <w:t>292</w:t>
+              <w:t>121</w:t>
             </w:r>
           </w:p>
         </w:tc>
@@ -458,7 +458,7 @@
           </w:tcPr>
           <w:p>
             <w:r>
-              <w:t>275</w:t>
+              <w:t>144</w:t>
             </w:r>
           </w:p>
         </w:tc>
@@ -480,7 +480,7 @@
           </w:tcPr>
           <w:p>
             <w:r>
-              <w:t>423</w:t>
+              <w:t>240</w:t>
             </w:r>
           </w:p>
         </w:tc>
@@ -502,7 +502,7 @@
           </w:tcPr>
           <w:p>
             <w:r>
-              <w:t>334</w:t>
+              <w:t>204</w:t>
             </w:r>
           </w:p>
         </w:tc>
@@ -524,7 +524,7 @@
           </w:tcPr>
           <w:p>
             <w:r>
-              <w:t>331</w:t>
+              <w:t>139</w:t>
             </w:r>
           </w:p>
         </w:tc>
@@ -546,7 +546,7 @@
           </w:tcPr>
           <w:p>
             <w:r>
-              <w:t>481</w:t>
+              <w:t>198</w:t>
             </w:r>
           </w:p>
         </w:tc>
@@ -568,7 +568,7 @@
           </w:tcPr>
           <w:p>
             <w:r>
-              <w:t>425</w:t>
+              <w:t>200</w:t>
             </w:r>
           </w:p>
         </w:tc>
@@ -590,7 +590,7 @@
           </w:tcPr>
           <w:p>
             <w:r>
-              <w:t>262</w:t>
+              <w:t>154</w:t>
             </w:r>
           </w:p>
         </w:tc>
@@ -612,7 +612,7 @@
           </w:tcPr>
           <w:p>
             <w:r>
-              <w:t>336</w:t>
+              <w:t>134</w:t>
             </w:r>
           </w:p>
         </w:tc>
@@ -634,7 +634,7 @@
           </w:tcPr>
           <w:p>
             <w:r>
-              <w:t>247</w:t>
+              <w:t>171</w:t>
             </w:r>
           </w:p>
         </w:tc>
@@ -656,7 +656,7 @@
           </w:tcPr>
           <w:p>
             <w:r>
-              <w:t>412</w:t>
+              <w:t>322</w:t>
             </w:r>
           </w:p>
         </w:tc>
@@ -678,7 +678,7 @@
           </w:tcPr>
           <w:p>
             <w:r>
-              <w:t>226</w:t>
+              <w:t>94</w:t>
             </w:r>
           </w:p>
         </w:tc>
@@ -700,7 +700,7 @@
           </w:tcPr>
           <w:p>
             <w:r>
-              <w:t>312</w:t>
+              <w:t>89</w:t>
             </w:r>
           </w:p>
         </w:tc>
@@ -722,7 +722,7 @@
           </w:tcPr>
           <w:p>
             <w:r>
-              <w:t>284</w:t>
+              <w:t>175</w:t>
             </w:r>
           </w:p>
         </w:tc>
@@ -744,7 +744,7 @@
           </w:tcPr>
           <w:p>
             <w:r>
-              <w:t>245</w:t>
+              <w:t>96</w:t>
             </w:r>
           </w:p>
         </w:tc>
@@ -766,7 +766,7 @@
           </w:tcPr>
           <w:p>
             <w:r>
-              <w:t>467</w:t>
+              <w:t>275</w:t>
             </w:r>
           </w:p>
         </w:tc>
@@ -788,7 +788,7 @@
           </w:tcPr>
           <w:p>
             <w:r>
-              <w:t>211</w:t>
+              <w:t>105</w:t>
             </w:r>
           </w:p>
         </w:tc>

</xml_diff>